<commit_message>
Modification des exigences fontionnelles et non fonctionnelles
</commit_message>
<xml_diff>
--- a/A2026_-_3GB_-_Document_exigences_-_Gabarit_revise.docx
+++ b/A2026_-_3GB_-_Document_exigences_-_Gabarit_revise.docx
@@ -3978,6 +3978,9 @@
         <w:br/>
       </w:r>
       <w:r>
+        <w:rPr>
+          <w:noProof/>
+        </w:rPr>
         <w:drawing>
           <wp:inline distT="0" distB="0" distL="0" distR="0" wp14:anchorId="312502F3" wp14:editId="2665E3BC">
             <wp:extent cx="5791641" cy="3675413"/>
@@ -6195,6 +6198,25 @@
     <w:p/>
     <w:p>
       <w:pPr>
+        <w:rPr>
+          <w:lang w:val="fr-CA"/>
+        </w:rPr>
+      </w:pPr>
+      <w:r>
+        <w:t xml:space="preserve">L’interface utilisateur va être adaptative. Cela </w:t>
+      </w:r>
+      <w:r>
+        <w:t>veut</w:t>
+      </w:r>
+      <w:r>
+        <w:t xml:space="preserve"> dire qu’elle va</w:t>
+      </w:r>
+      <w:r>
+        <w:t xml:space="preserve"> pouvoir s’afficher sur ordinateur peux importe le navigateur, mais aussi sur téléphone ou tablette. </w:t>
+      </w:r>
+    </w:p>
+    <w:p>
+      <w:pPr>
         <w:pStyle w:val="Titre3"/>
       </w:pPr>
       <w:bookmarkStart w:id="35" w:name="_Toc207617210"/>
@@ -6209,119 +6231,154 @@
       </w:r>
       <w:bookmarkEnd w:id="35"/>
     </w:p>
+    <w:p/>
+    <w:p>
+      <w:r>
+        <w:t xml:space="preserve">L’accès à l’espace de gestion aura sont propre mot de passe chiffré ainsi qu’un identifiant unique. De plus, il y aura plusieurs mesures de sécurité lors de la création d’un compte. </w:t>
+      </w:r>
+    </w:p>
     <w:p>
       <w:pPr>
         <w:pStyle w:val="Titre3"/>
       </w:pPr>
+      <w:bookmarkStart w:id="36" w:name="_Toc207617211"/>
+      <w:r>
+        <w:t>1.3.</w:t>
+      </w:r>
+      <w:r>
+        <w:t xml:space="preserve">1.3 </w:t>
+      </w:r>
+      <w:r>
+        <w:t>Disponibilité</w:t>
+      </w:r>
+      <w:bookmarkEnd w:id="36"/>
+    </w:p>
+    <w:p/>
+    <w:p>
+      <w:r>
+        <w:t xml:space="preserve">Le site web va être accessible 24 heures sur 24 et 7 jours sur 7 pour maximiser les potentielles commandes même en dehors des heures d’ouverture du magasin. </w:t>
+      </w:r>
     </w:p>
     <w:p>
       <w:pPr>
         <w:pStyle w:val="Titre3"/>
       </w:pPr>
-      <w:bookmarkStart w:id="36" w:name="_Toc207617211"/>
+      <w:bookmarkStart w:id="37" w:name="_Toc207617212"/>
       <w:r>
         <w:t>1.3.</w:t>
       </w:r>
       <w:r>
-        <w:t xml:space="preserve">1.3 </w:t>
-      </w:r>
-      <w:r>
-        <w:t>Disponibilité</w:t>
-      </w:r>
-      <w:bookmarkEnd w:id="36"/>
+        <w:t xml:space="preserve">1.4 </w:t>
+      </w:r>
+      <w:r>
+        <w:t>Instrumentation du code</w:t>
+      </w:r>
+      <w:r>
+        <w:t xml:space="preserve"> (observabilité et monitoring)</w:t>
+      </w:r>
+      <w:bookmarkEnd w:id="37"/>
     </w:p>
     <w:p/>
     <w:p>
+      <w:r>
+        <w:t xml:space="preserve">Au besoin, il y aura un moyen de voir les potentielles erreur à l’aide d’un logger pour pouvoir debugger des potentielles erreurs qui pourrai survenir.  </w:t>
+      </w:r>
+    </w:p>
+    <w:p>
       <w:pPr>
         <w:pStyle w:val="Titre3"/>
       </w:pPr>
-      <w:bookmarkStart w:id="37" w:name="_Toc207617212"/>
+      <w:bookmarkStart w:id="38" w:name="_Toc207617213"/>
       <w:r>
         <w:t>1.3.</w:t>
       </w:r>
       <w:r>
-        <w:t xml:space="preserve">1.4 </w:t>
-      </w:r>
-      <w:r>
-        <w:t>Instrumentation du code</w:t>
-      </w:r>
-      <w:r>
-        <w:t xml:space="preserve"> (observabilité et monitoring)</w:t>
-      </w:r>
-      <w:bookmarkEnd w:id="37"/>
+        <w:t xml:space="preserve">1.5 </w:t>
+      </w:r>
+      <w:r>
+        <w:t>Déploiement</w:t>
+      </w:r>
+      <w:bookmarkEnd w:id="38"/>
+    </w:p>
+    <w:p/>
+    <w:p>
+      <w:r>
+        <w:t>Le site va être déployer sur un environnent de server web qui sera relié à un système de base de données relationnelle.</w:t>
+      </w:r>
     </w:p>
     <w:p>
       <w:pPr>
         <w:pStyle w:val="Titre3"/>
       </w:pPr>
-    </w:p>
-    <w:p>
-      <w:pPr>
-        <w:pStyle w:val="Titre3"/>
-      </w:pPr>
-      <w:bookmarkStart w:id="38" w:name="_Toc207617213"/>
+      <w:bookmarkStart w:id="39" w:name="_Toc207617214"/>
       <w:r>
         <w:t>1.3.</w:t>
       </w:r>
       <w:r>
-        <w:t xml:space="preserve">1.5 </w:t>
-      </w:r>
-      <w:r>
-        <w:t>Déploiement</w:t>
-      </w:r>
-      <w:bookmarkEnd w:id="38"/>
-    </w:p>
-    <w:p>
-      <w:pPr>
-        <w:pStyle w:val="Titre3"/>
-      </w:pPr>
-    </w:p>
-    <w:p>
-      <w:pPr>
-        <w:pStyle w:val="Titre3"/>
-      </w:pPr>
-      <w:bookmarkStart w:id="39" w:name="_Toc207617214"/>
-      <w:r>
+        <w:t xml:space="preserve">1.6 </w:t>
+      </w:r>
+      <w:r>
+        <w:t>Test unitaire</w:t>
+      </w:r>
+      <w:bookmarkEnd w:id="39"/>
+    </w:p>
+    <w:p/>
+    <w:p>
+      <w:r>
+        <w:t xml:space="preserve">Plusieurs test unitaires vont être fait afin de valider automatiquement le code et s’assurer que rien ne se casse lors d’une modification ou d’un ajout au système. </w:t>
+      </w:r>
+    </w:p>
+    <w:p/>
+    <w:p>
+      <w:pPr>
+        <w:pStyle w:val="Titre2"/>
+      </w:pPr>
+      <w:bookmarkStart w:id="40" w:name="_Toc207617215"/>
+      <w:r>
+        <w:lastRenderedPageBreak/>
         <w:t>1.3.</w:t>
       </w:r>
       <w:r>
-        <w:t xml:space="preserve">1.6 </w:t>
-      </w:r>
-      <w:r>
-        <w:t>Test unitaire</w:t>
-      </w:r>
-      <w:bookmarkEnd w:id="39"/>
+        <w:t xml:space="preserve">2 </w:t>
+      </w:r>
+      <w:r>
+        <w:t>Exigences fonctionnelles</w:t>
+      </w:r>
+      <w:bookmarkEnd w:id="40"/>
     </w:p>
     <w:p/>
     <w:p>
-      <w:pPr>
-        <w:pStyle w:val="Titre2"/>
-      </w:pPr>
-      <w:bookmarkStart w:id="40" w:name="_Toc207617215"/>
-      <w:r>
-        <w:t>1.3.</w:t>
-      </w:r>
-      <w:r>
-        <w:t xml:space="preserve">2 </w:t>
-      </w:r>
-      <w:r>
-        <w:t>Exigences fonctionnelles</w:t>
-      </w:r>
-      <w:bookmarkEnd w:id="40"/>
+      <w:r>
+        <w:t>« </w:t>
+      </w:r>
+      <w:r>
+        <w:t>Une exigence fonctionnelle est une exigence définissant une fonction du système à développer. Ce que le système doit faire.</w:t>
+      </w:r>
+      <w:r>
+        <w:t> »</w:t>
+      </w:r>
     </w:p>
     <w:p/>
     <w:p>
       <w:r>
-        <w:t>« </w:t>
-      </w:r>
-      <w:r>
-        <w:t>Une exigence fonctionnelle est une exigence définissant une fonction du système à développer. Ce que le système doit faire.</w:t>
-      </w:r>
-      <w:r>
-        <w:t> »</w:t>
-      </w:r>
-    </w:p>
-    <w:p/>
+        <w:t>Pour commencer il y aura une page d’accueil. Elle a pour but de dire l’histoire de la pâtisserie</w:t>
+      </w:r>
+      <w:r>
+        <w:t xml:space="preserve"> avec les heures d’ouverture afin de capter l’attention d’un potentiel client. De plus, il y aura une page </w:t>
+      </w:r>
+      <w:r>
+        <w:t xml:space="preserve">pour afficher tout le catalogue de produits ainsi que leur </w:t>
+      </w:r>
+      <w:r>
+        <w:t>nom, photo, prix, s’ils contiennent des aliments allergènes, etc</w:t>
+      </w:r>
+      <w:r>
+        <w:t>.</w:t>
+      </w:r>
+      <w:r>
+        <w:t xml:space="preserve"> Ensuite, il y aura une page qui affichera le contenu du panier du client en ce moment. De suite, il y aura une page pour les gâteaux sur mesure qui permet au client un gâteaux de faire leur propre gâteau unique. De plus, il y aura une page contact qui affichera les coordonnées du magasin afin que les clients pussent entrer en contact avec le magasin s’ils ont des questions ou demande supplémentaire. Finalement, il y aura une page de gestion qui sera uniquement accessible par un administrateur afin de vérifier le stock des produits avec l’option de changer leur prix, ou leur disponibilité, mais aussi qui lui donnera accès de voir toutes les commandes présente.  </w:t>
+      </w:r>
+    </w:p>
     <w:p>
       <w:pPr>
         <w:rPr>
@@ -10689,6 +10746,7 @@
   <w:style w:type="character" w:default="1" w:styleId="Policepardfaut">
     <w:name w:val="Default Paragraph Font"/>
     <w:uiPriority w:val="1"/>
+    <w:semiHidden/>
     <w:unhideWhenUsed/>
   </w:style>
   <w:style w:type="table" w:default="1" w:styleId="TableauNormal">

</xml_diff>